<commit_message>
feat: integrate Cloudinary for book image management and add enhanced circulation lookup services
</commit_message>
<xml_diff>
--- a/report/main.docx
+++ b/report/main.docx
@@ -6028,10 +6028,10 @@
           <w:b/>
           <w:bCs/>
         </w:rPr>
-        <w:t xml:space="preserve">Digital PDF Repository</w:t>
-      </w:r>
-      <w:r>
-        <w:t xml:space="preserve">: Provides secured cloud/local storage of digitized literature with embedded PDF viewers and download endpoints.</w:t>
+        <w:t xml:space="preserve">Digital Media &amp; Book Catalog Subsystem</w:t>
+      </w:r>
+      <w:r>
+        <w:t xml:space="preserve">: Houses bibliographic records with cloud-hosted high-resolution cover images managed via Cloudinary CDN and in-memory Multer streams, incorporating automated asset deletion rollbacks on failed transactions, alongside digital PDF document reading and downloads.</w:t>
       </w:r>
     </w:p>
     <w:p>
@@ -6911,7 +6911,7 @@
         <w:t xml:space="preserve">Book &amp; Category</w:t>
       </w:r>
       <w:r>
-        <w:t xml:space="preserve">: Houses bibliographic metadata (ISBN, title, author, edition, description, PDF URL) linked to specific thematic categories.</w:t>
+        <w:t xml:space="preserve">: Houses bibliographic metadata (ISBN, title, author, edition, description, cover image URL, PDF URL) linked to specific thematic categories.</w:t>
       </w:r>
     </w:p>
     <w:p>
@@ -7087,6 +7087,24 @@
       </w:r>
       <w:r>
         <w:t xml:space="preserve">: Next.js 15 (React 19) utilizing the App Router architecture, styled with TailwindCSS, Lucide React icons, and Radix UI primitives.</w:t>
+      </w:r>
+    </w:p>
+    <w:p>
+      <w:pPr>
+        <w:numPr>
+          <w:ilvl w:val="0"/>
+          <w:numId w:val="1014"/>
+        </w:numPr>
+      </w:pPr>
+      <w:r>
+        <w:rPr>
+          <w:b/>
+          <w:bCs/>
+        </w:rPr>
+        <w:t xml:space="preserve">Cloud Asset Storage &amp; Media</w:t>
+      </w:r>
+      <w:r>
+        <w:t xml:space="preserve">: Cloudinary CDN and in-memory Multer streaming for scalable cover image hosting, featuring automated transactional rollback cleanup.</w:t>
       </w:r>
     </w:p>
     <w:p>
@@ -13151,7 +13169,7 @@
               <w:jc w:val="left"/>
             </w:pPr>
             <w:r>
-              <w:t xml:space="preserve">/api/v1/books/search</w:t>
+              <w:t xml:space="preserve">/api/v1/book</w:t>
             </w:r>
           </w:p>
         </w:tc>
@@ -13175,7 +13193,7 @@
               <w:jc w:val="left"/>
             </w:pPr>
             <w:r>
-              <w:t xml:space="preserve">Multi-criteria book &amp; shelf location search</w:t>
+              <w:t xml:space="preserve">Catalog query with spatial &amp; category filters</w:t>
             </w:r>
           </w:p>
         </w:tc>
@@ -13201,31 +13219,31 @@
               <w:jc w:val="left"/>
             </w:pPr>
             <w:r>
-              <w:t xml:space="preserve">/api/v1/books</w:t>
-            </w:r>
-          </w:p>
-        </w:tc>
-        <w:tc>
-          <w:tcPr/>
-          <w:p>
-            <w:pPr>
-              <w:pStyle w:val="Compact"/>
-              <w:jc w:val="left"/>
-            </w:pPr>
-            <w:r>
-              <w:t xml:space="preserve">Admin</w:t>
-            </w:r>
-          </w:p>
-        </w:tc>
-        <w:tc>
-          <w:tcPr/>
-          <w:p>
-            <w:pPr>
-              <w:pStyle w:val="Compact"/>
-              <w:jc w:val="left"/>
-            </w:pPr>
-            <w:r>
-              <w:t xml:space="preserve">Create book record with PDF asset</w:t>
+              <w:t xml:space="preserve">/api/v1/book/upload-image</w:t>
+            </w:r>
+          </w:p>
+        </w:tc>
+        <w:tc>
+          <w:tcPr/>
+          <w:p>
+            <w:pPr>
+              <w:pStyle w:val="Compact"/>
+              <w:jc w:val="left"/>
+            </w:pPr>
+            <w:r>
+              <w:t xml:space="preserve">Staff / Admin</w:t>
+            </w:r>
+          </w:p>
+        </w:tc>
+        <w:tc>
+          <w:tcPr/>
+          <w:p>
+            <w:pPr>
+              <w:pStyle w:val="Compact"/>
+              <w:jc w:val="left"/>
+            </w:pPr>
+            <w:r>
+              <w:t xml:space="preserve">Stream &amp; upload book cover to Cloudinary</w:t>
             </w:r>
           </w:p>
         </w:tc>
@@ -13251,31 +13269,31 @@
               <w:jc w:val="left"/>
             </w:pPr>
             <w:r>
-              <w:t xml:space="preserve">/api/v1/circulation/issue</w:t>
-            </w:r>
-          </w:p>
-        </w:tc>
-        <w:tc>
-          <w:tcPr/>
-          <w:p>
-            <w:pPr>
-              <w:pStyle w:val="Compact"/>
-              <w:jc w:val="left"/>
-            </w:pPr>
-            <w:r>
-              <w:t xml:space="preserve">Staff</w:t>
-            </w:r>
-          </w:p>
-        </w:tc>
-        <w:tc>
-          <w:tcPr/>
-          <w:p>
-            <w:pPr>
-              <w:pStyle w:val="Compact"/>
-              <w:jc w:val="left"/>
-            </w:pPr>
-            <w:r>
-              <w:t xml:space="preserve">Issue physical book copy to student</w:t>
+              <w:t xml:space="preserve">/api/v1/book</w:t>
+            </w:r>
+          </w:p>
+        </w:tc>
+        <w:tc>
+          <w:tcPr/>
+          <w:p>
+            <w:pPr>
+              <w:pStyle w:val="Compact"/>
+              <w:jc w:val="left"/>
+            </w:pPr>
+            <w:r>
+              <w:t xml:space="preserve">Staff / Admin</w:t>
+            </w:r>
+          </w:p>
+        </w:tc>
+        <w:tc>
+          <w:tcPr/>
+          <w:p>
+            <w:pPr>
+              <w:pStyle w:val="Compact"/>
+              <w:jc w:val="left"/>
+            </w:pPr>
+            <w:r>
+              <w:t xml:space="preserve">Create book record with cover &amp; PDF asset</w:t>
             </w:r>
           </w:p>
         </w:tc>
@@ -13289,43 +13307,43 @@
               <w:jc w:val="left"/>
             </w:pPr>
             <w:r>
-              <w:t xml:space="preserve">POST</w:t>
-            </w:r>
-          </w:p>
-        </w:tc>
-        <w:tc>
-          <w:tcPr/>
-          <w:p>
-            <w:pPr>
-              <w:pStyle w:val="Compact"/>
-              <w:jc w:val="left"/>
-            </w:pPr>
-            <w:r>
-              <w:t xml:space="preserve">/api/v1/circulation/renew</w:t>
-            </w:r>
-          </w:p>
-        </w:tc>
-        <w:tc>
-          <w:tcPr/>
-          <w:p>
-            <w:pPr>
-              <w:pStyle w:val="Compact"/>
-              <w:jc w:val="left"/>
-            </w:pPr>
-            <w:r>
-              <w:t xml:space="preserve">Student / Staff</w:t>
-            </w:r>
-          </w:p>
-        </w:tc>
-        <w:tc>
-          <w:tcPr/>
-          <w:p>
-            <w:pPr>
-              <w:pStyle w:val="Compact"/>
-              <w:jc w:val="left"/>
-            </w:pPr>
-            <w:r>
-              <w:t xml:space="preserve">Request or approve loan renewal</w:t>
+              <w:t xml:space="preserve">PATCH</w:t>
+            </w:r>
+          </w:p>
+        </w:tc>
+        <w:tc>
+          <w:tcPr/>
+          <w:p>
+            <w:pPr>
+              <w:pStyle w:val="Compact"/>
+              <w:jc w:val="left"/>
+            </w:pPr>
+            <w:r>
+              <w:t xml:space="preserve">/api/v1/book/:id</w:t>
+            </w:r>
+          </w:p>
+        </w:tc>
+        <w:tc>
+          <w:tcPr/>
+          <w:p>
+            <w:pPr>
+              <w:pStyle w:val="Compact"/>
+              <w:jc w:val="left"/>
+            </w:pPr>
+            <w:r>
+              <w:t xml:space="preserve">Staff / Admin</w:t>
+            </w:r>
+          </w:p>
+        </w:tc>
+        <w:tc>
+          <w:tcPr/>
+          <w:p>
+            <w:pPr>
+              <w:pStyle w:val="Compact"/>
+              <w:jc w:val="left"/>
+            </w:pPr>
+            <w:r>
+              <w:t xml:space="preserve">Update book metadata and cover image</w:t>
             </w:r>
           </w:p>
         </w:tc>
@@ -13339,6 +13357,56 @@
               <w:jc w:val="left"/>
             </w:pPr>
             <w:r>
+              <w:t xml:space="preserve">DELETE</w:t>
+            </w:r>
+          </w:p>
+        </w:tc>
+        <w:tc>
+          <w:tcPr/>
+          <w:p>
+            <w:pPr>
+              <w:pStyle w:val="Compact"/>
+              <w:jc w:val="left"/>
+            </w:pPr>
+            <w:r>
+              <w:t xml:space="preserve">/api/v1/book/:id</w:t>
+            </w:r>
+          </w:p>
+        </w:tc>
+        <w:tc>
+          <w:tcPr/>
+          <w:p>
+            <w:pPr>
+              <w:pStyle w:val="Compact"/>
+              <w:jc w:val="left"/>
+            </w:pPr>
+            <w:r>
+              <w:t xml:space="preserve">Staff / Admin</w:t>
+            </w:r>
+          </w:p>
+        </w:tc>
+        <w:tc>
+          <w:tcPr/>
+          <w:p>
+            <w:pPr>
+              <w:pStyle w:val="Compact"/>
+              <w:jc w:val="left"/>
+            </w:pPr>
+            <w:r>
+              <w:t xml:space="preserve">Deactivate book and clean up cloud assets</w:t>
+            </w:r>
+          </w:p>
+        </w:tc>
+      </w:tr>
+      <w:tr>
+        <w:tc>
+          <w:tcPr/>
+          <w:p>
+            <w:pPr>
+              <w:pStyle w:val="Compact"/>
+              <w:jc w:val="left"/>
+            </w:pPr>
+            <w:r>
               <w:t xml:space="preserve">POST</w:t>
             </w:r>
           </w:p>
@@ -13351,7 +13419,107 @@
               <w:jc w:val="left"/>
             </w:pPr>
             <w:r>
-              <w:t xml:space="preserve">/api/v1/circulation/return</w:t>
+              <w:t xml:space="preserve">/api/v1/loan/issue</w:t>
+            </w:r>
+          </w:p>
+        </w:tc>
+        <w:tc>
+          <w:tcPr/>
+          <w:p>
+            <w:pPr>
+              <w:pStyle w:val="Compact"/>
+              <w:jc w:val="left"/>
+            </w:pPr>
+            <w:r>
+              <w:t xml:space="preserve">Staff</w:t>
+            </w:r>
+          </w:p>
+        </w:tc>
+        <w:tc>
+          <w:tcPr/>
+          <w:p>
+            <w:pPr>
+              <w:pStyle w:val="Compact"/>
+              <w:jc w:val="left"/>
+            </w:pPr>
+            <w:r>
+              <w:t xml:space="preserve">Issue physical book copy to student</w:t>
+            </w:r>
+          </w:p>
+        </w:tc>
+      </w:tr>
+      <w:tr>
+        <w:tc>
+          <w:tcPr/>
+          <w:p>
+            <w:pPr>
+              <w:pStyle w:val="Compact"/>
+              <w:jc w:val="left"/>
+            </w:pPr>
+            <w:r>
+              <w:t xml:space="preserve">POST</w:t>
+            </w:r>
+          </w:p>
+        </w:tc>
+        <w:tc>
+          <w:tcPr/>
+          <w:p>
+            <w:pPr>
+              <w:pStyle w:val="Compact"/>
+              <w:jc w:val="left"/>
+            </w:pPr>
+            <w:r>
+              <w:t xml:space="preserve">/api/v1/loan/renew</w:t>
+            </w:r>
+          </w:p>
+        </w:tc>
+        <w:tc>
+          <w:tcPr/>
+          <w:p>
+            <w:pPr>
+              <w:pStyle w:val="Compact"/>
+              <w:jc w:val="left"/>
+            </w:pPr>
+            <w:r>
+              <w:t xml:space="preserve">Student / Staff</w:t>
+            </w:r>
+          </w:p>
+        </w:tc>
+        <w:tc>
+          <w:tcPr/>
+          <w:p>
+            <w:pPr>
+              <w:pStyle w:val="Compact"/>
+              <w:jc w:val="left"/>
+            </w:pPr>
+            <w:r>
+              <w:t xml:space="preserve">Request or approve loan renewal</w:t>
+            </w:r>
+          </w:p>
+        </w:tc>
+      </w:tr>
+      <w:tr>
+        <w:tc>
+          <w:tcPr/>
+          <w:p>
+            <w:pPr>
+              <w:pStyle w:val="Compact"/>
+              <w:jc w:val="left"/>
+            </w:pPr>
+            <w:r>
+              <w:t xml:space="preserve">POST</w:t>
+            </w:r>
+          </w:p>
+        </w:tc>
+        <w:tc>
+          <w:tcPr/>
+          <w:p>
+            <w:pPr>
+              <w:pStyle w:val="Compact"/>
+              <w:jc w:val="left"/>
+            </w:pPr>
+            <w:r>
+              <w:t xml:space="preserve">/api/v1/loan/return</w:t>
             </w:r>
           </w:p>
         </w:tc>

</xml_diff>